<commit_message>
fix: repair ADS-B guide Word compatibility
</commit_message>
<xml_diff>
--- a/TaiLieu/Huong_dan_su_dung_Tool_ADS-B_20260919.docx
+++ b/TaiLieu/Huong_dan_su_dung_Tool_ADS-B_20260919.docx
@@ -60,11 +60,21 @@
       </w:r>
     </w:p>
     <w:p>
-      <w:fldChar w:fldCharType="begin"/>
-      <w:instrText w:space="preserve"> TOC \o "1-2" \h \z \u </w:instrText>
-      <w:fldChar w:fldCharType="separate"/>
-      <w:t>Nhấn Ctrl+A rồi F9 trong Word để cập nhật mục lục.</w:t>
-      <w:fldChar w:fldCharType="end"/>
+      <w:r>
+        <w:fldChar w:fldCharType="begin"/>
+      </w:r>
+      <w:r>
+        <w:instrText w:space="preserve"> TOC \o "1-2" \h \z \u </w:instrText>
+      </w:r>
+      <w:r>
+        <w:fldChar w:fldCharType="separate"/>
+      </w:r>
+      <w:r>
+        <w:t>Nhấn Ctrl+A rồi F9 trong Word để cập nhật mục lục.</w:t>
+      </w:r>
+      <w:r>
+        <w:fldChar w:fldCharType="end"/>
+      </w:r>
     </w:p>
     <w:p>
       <w:r>

</xml_diff>

<commit_message>
docs: focus ADS-B guide on TracksSync
</commit_message>
<xml_diff>
--- a/TaiLieu/Huong_dan_su_dung_Tool_ADS-B_20260919.docx
+++ b/TaiLieu/Huong_dan_su_dung_Tool_ADS-B_20260919.docx
@@ -12,38 +12,23 @@
         <w:rPr>
           <w:rFonts w:ascii="Arial" w:hAnsi="Arial"/>
           <w:b/>
-          <w:sz w:val="46"/>
+          <w:sz w:val="44"/>
         </w:rPr>
         <w:t>TÀI LIỆU HƯỚNG DẪN SỬ DỤNG</w:t>
+        <w:br/>
+        <w:t>CÔNG CỤ TRACKSSYNCPYTHON</w:t>
       </w:r>
     </w:p>
     <w:p>
       <w:pPr>
-        <w:pStyle w:val="Title"/>
-        <w:jc w:val="center"/>
-      </w:pPr>
-      <w:r>
-        <w:rPr>
-          <w:rFonts w:ascii="Arial" w:hAnsi="Arial"/>
-          <w:b/>
-          <w:sz w:val="40"/>
-        </w:rPr>
-        <w:t>CÔNG CỤ ĐỒNG BỘ VÀ THEO DÕI ADS-B</w:t>
-      </w:r>
-    </w:p>
-    <w:p>
-      <w:pPr>
-        <w:spacing w:before="920"/>
         <w:jc w:val="center"/>
       </w:pPr>
       <w:r>
         <w:t>Hệ thống Quản lý luồng không lưu Việt Nam - ATFM Web</w:t>
         <w:br/>
-        <w:t>Thành phần: TracksSync và Flight Tracking API</w:t>
+        <w:t>Vị trí mã nguồn: tools\TracksSyncPython\</w:t>
         <w:br/>
-        <w:t>Phiên bản tài liệu: 1.0</w:t>
-        <w:br/>
-        <w:t>Ngày cập nhật: 19/09/2026</w:t>
+        <w:t>Phiên bản: 1.1 | Ngày cập nhật: 19/09/2026</w:t>
       </w:r>
     </w:p>
     <w:p>
@@ -91,288 +76,13 @@
     </w:p>
     <w:p>
       <w:r>
-        <w:t>Bộ công cụ ADS-B phục vụ hai nhu cầu bổ trợ trong ATFM: lưu dữ liệu giám sát để báo cáo, và cung cấp vị trí tàu bay gần thời gian thực cho bản đồ theo dõi. Tài liệu này hướng dẫn cán bộ vận hành sử dụng TracksSync và kiểm tra Flight Tracking API; không thay thế tài liệu quản trị cơ sở dữ liệu hoặc hướng dẫn triển khai hạ tầng.</w:t>
+        <w:t>Tài liệu này chỉ hướng dẫn tools\TracksSyncPython. Công cụ đọc dữ liệu vị trí tàu bay từ PostgreSQL public.tracks, lọc theo FIR VVHN/VVHM, đối chiếu Oracle và ghi vào ATFM.T_TRACKS_LOG.</w:t>
       </w:r>
     </w:p>
     <w:tbl>
       <w:tblPr>
         <w:tblStyle w:val="TableGrid"/>
         <w:tblW w:type="auto" w:w="0"/>
-        <w:tblLayout w:type="autofit"/>
-        <w:tblLook w:firstColumn="1" w:firstRow="1" w:lastColumn="0" w:lastRow="0" w:noHBand="0" w:noVBand="1" w:val="04A0"/>
-      </w:tblPr>
-      <w:tblGrid>
-        <w:gridCol w:w="3324"/>
-        <w:gridCol w:w="3324"/>
-        <w:gridCol w:w="3324"/>
-      </w:tblGrid>
-      <w:tr>
-        <w:tc>
-          <w:tcPr>
-            <w:tcW w:type="dxa" w:w="3324"/>
-            <w:shd w:fill="D9EAF7"/>
-          </w:tcPr>
-          <w:p>
-            <w:pPr>
-              <w:jc w:val="left"/>
-            </w:pPr>
-            <w:r>
-              <w:rPr>
-                <w:b/>
-              </w:rPr>
-              <w:t>Thành phần</w:t>
-            </w:r>
-          </w:p>
-        </w:tc>
-        <w:tc>
-          <w:tcPr>
-            <w:tcW w:type="dxa" w:w="3324"/>
-            <w:shd w:fill="D9EAF7"/>
-          </w:tcPr>
-          <w:p>
-            <w:pPr>
-              <w:jc w:val="left"/>
-            </w:pPr>
-            <w:r>
-              <w:rPr>
-                <w:b/>
-              </w:rPr>
-              <w:t>Mục đích</w:t>
-            </w:r>
-          </w:p>
-        </w:tc>
-        <w:tc>
-          <w:tcPr>
-            <w:tcW w:type="dxa" w:w="3324"/>
-            <w:shd w:fill="D9EAF7"/>
-          </w:tcPr>
-          <w:p>
-            <w:pPr>
-              <w:jc w:val="left"/>
-            </w:pPr>
-            <w:r>
-              <w:rPr>
-                <w:b/>
-              </w:rPr>
-              <w:t>Dữ liệu xử lý</w:t>
-            </w:r>
-          </w:p>
-        </w:tc>
-      </w:tr>
-      <w:tr>
-        <w:tc>
-          <w:tcPr>
-            <w:tcW w:type="dxa" w:w="3324"/>
-          </w:tcPr>
-          <w:p>
-            <w:pPr>
-              <w:jc w:val="left"/>
-            </w:pPr>
-            <w:r>
-              <w:rPr>
-                <w:b w:val="0"/>
-              </w:rPr>
-              <w:t>TracksSync</w:t>
-            </w:r>
-          </w:p>
-        </w:tc>
-        <w:tc>
-          <w:tcPr>
-            <w:tcW w:type="dxa" w:w="3324"/>
-          </w:tcPr>
-          <w:p>
-            <w:pPr>
-              <w:jc w:val="left"/>
-            </w:pPr>
-            <w:r>
-              <w:rPr>
-                <w:b w:val="0"/>
-              </w:rPr>
-              <w:t>Đồng bộ, đối chiếu và xác minh dữ liệu ADS-B theo chu kỳ.</w:t>
-            </w:r>
-          </w:p>
-        </w:tc>
-        <w:tc>
-          <w:tcPr>
-            <w:tcW w:type="dxa" w:w="3324"/>
-          </w:tcPr>
-          <w:p>
-            <w:pPr>
-              <w:jc w:val="left"/>
-            </w:pPr>
-            <w:r>
-              <w:rPr>
-                <w:b w:val="0"/>
-              </w:rPr>
-              <w:t>PostgreSQL public.tracks -&gt; Oracle T_TRACKS_LOG.</w:t>
-            </w:r>
-          </w:p>
-        </w:tc>
-      </w:tr>
-      <w:tr>
-        <w:tc>
-          <w:tcPr>
-            <w:tcW w:type="dxa" w:w="3324"/>
-          </w:tcPr>
-          <w:p>
-            <w:pPr>
-              <w:jc w:val="left"/>
-            </w:pPr>
-            <w:r>
-              <w:rPr>
-                <w:b w:val="0"/>
-              </w:rPr>
-              <w:t>Flight Tracking API</w:t>
-            </w:r>
-          </w:p>
-        </w:tc>
-        <w:tc>
-          <w:tcPr>
-            <w:tcW w:type="dxa" w:w="3324"/>
-          </w:tcPr>
-          <w:p>
-            <w:pPr>
-              <w:jc w:val="left"/>
-            </w:pPr>
-            <w:r>
-              <w:rPr>
-                <w:b w:val="0"/>
-              </w:rPr>
-              <w:t>Cung cấp vị trí mới nhất cho FlightTrackingMap của ATFM Web.</w:t>
-            </w:r>
-          </w:p>
-        </w:tc>
-        <w:tc>
-          <w:tcPr>
-            <w:tcW w:type="dxa" w:w="3324"/>
-          </w:tcPr>
-          <w:p>
-            <w:pPr>
-              <w:jc w:val="left"/>
-            </w:pPr>
-            <w:r>
-              <w:rPr>
-                <w:b w:val="0"/>
-              </w:rPr>
-              <w:t>Đọc PostgreSQL public.tracks qua HTTP nội bộ.</w:t>
-            </w:r>
-          </w:p>
-        </w:tc>
-      </w:tr>
-      <w:tr>
-        <w:tc>
-          <w:tcPr>
-            <w:tcW w:type="dxa" w:w="3324"/>
-          </w:tcPr>
-          <w:p>
-            <w:pPr>
-              <w:jc w:val="left"/>
-            </w:pPr>
-            <w:r>
-              <w:rPr>
-                <w:b w:val="0"/>
-              </w:rPr>
-              <w:t>ATFM Web</w:t>
-            </w:r>
-          </w:p>
-        </w:tc>
-        <w:tc>
-          <w:tcPr>
-            <w:tcW w:type="dxa" w:w="3324"/>
-          </w:tcPr>
-          <w:p>
-            <w:pPr>
-              <w:jc w:val="left"/>
-            </w:pPr>
-            <w:r>
-              <w:rPr>
-                <w:b w:val="0"/>
-              </w:rPr>
-              <w:t>Hiển thị bản đồ và báo cáo ADS-B cho người dùng nghiệp vụ.</w:t>
-            </w:r>
-          </w:p>
-        </w:tc>
-        <w:tc>
-          <w:tcPr>
-            <w:tcW w:type="dxa" w:w="3324"/>
-          </w:tcPr>
-          <w:p>
-            <w:pPr>
-              <w:jc w:val="left"/>
-            </w:pPr>
-            <w:r>
-              <w:rPr>
-                <w:b w:val="0"/>
-              </w:rPr>
-              <w:t>T_TRACKS_LOG, Flight Tracking API và metadata Oracle.</w:t>
-            </w:r>
-          </w:p>
-        </w:tc>
-      </w:tr>
-    </w:tbl>
-    <w:p>
-      <w:r>
-        <w:t>Luồng dữ liệu tổng quát: public.tracks -&gt; TracksSync -&gt; T_TRACKS_LOG -&gt; báo cáo ADS-B; đồng thời public.tracks -&gt; Flight Tracking API -&gt; FlightTrackingMap.</w:t>
-      </w:r>
-    </w:p>
-    <w:p>
-      <w:pPr>
-        <w:pStyle w:val="Heading1"/>
-      </w:pPr>
-      <w:r>
-        <w:t>1. Chuẩn bị và cài đặt</w:t>
-      </w:r>
-    </w:p>
-    <w:p>
-      <w:pPr>
-        <w:pStyle w:val="ListBullet"/>
-      </w:pPr>
-      <w:r>
-        <w:t>Máy chạy công cụ là Windows 10/11 64-bit và kết nối được tới PostgreSQL, Oracle, cũng như file GeoJSON vùng FIR VVHN/VVHM.</w:t>
-      </w:r>
-    </w:p>
-    <w:p>
-      <w:pPr>
-        <w:pStyle w:val="ListBullet"/>
-      </w:pPr>
-      <w:r>
-        <w:t>Dùng bản EXE đã đóng gói khi vận hành thông thường: ATFM-TracksSync.exe cho giao diện, ATFM-TracksSync-CLI.exe cho Task Scheduler và ATFM-FlightTrackingApi.exe cho dịch vụ API.</w:t>
-      </w:r>
-    </w:p>
-    <w:p>
-      <w:pPr>
-        <w:pStyle w:val="ListBullet"/>
-      </w:pPr>
-      <w:r>
-        <w:t>Đặt TracksSync.local.json cạnh EXE khi triển khai riêng; file cấu hình và watermark chứa thông tin vận hành nên không đưa lên Git hoặc gửi qua kênh không được phép.</w:t>
-      </w:r>
-    </w:p>
-    <w:p>
-      <w:pPr>
-        <w:pStyle w:val="ListBullet"/>
-      </w:pPr>
-      <w:r>
-        <w:t>Không chạy hai phiên TracksSync cùng dùng một bảng T_TRACKS_LOG hoặc một file watermark.</w:t>
-      </w:r>
-    </w:p>
-    <w:p>
-      <w:pPr>
-        <w:pStyle w:val="Heading1"/>
-      </w:pPr>
-      <w:r>
-        <w:t>2. Cấu hình kết nối</w:t>
-      </w:r>
-    </w:p>
-    <w:p>
-      <w:r>
-        <w:t>TracksSync ưu tiên cấu hình theo thứ tự: biến môi trường TRACKS_CONFIG, file TracksSync.local.json cạnh chương trình, sau đó tới prjApplication\App_Data\TracksSync.local.json. Flight Tracking API dùng FlightTrackingApi.local.json cạnh EXE hoặc các biến môi trường FLIGHT_API_PG_* và FLIGHT_API_HOST/PORT.</w:t>
-      </w:r>
-    </w:p>
-    <w:tbl>
-      <w:tblPr>
-        <w:tblStyle w:val="TableGrid"/>
-        <w:tblW w:type="auto" w:w="0"/>
-        <w:tblLayout w:type="autofit"/>
         <w:tblLook w:firstColumn="1" w:firstRow="1" w:lastColumn="0" w:lastRow="0" w:noHBand="0" w:noVBand="1" w:val="04A0"/>
       </w:tblPr>
       <w:tblGrid>
@@ -386,14 +96,11 @@
             <w:shd w:fill="D9EAF7"/>
           </w:tcPr>
           <w:p>
-            <w:pPr>
-              <w:jc w:val="left"/>
-            </w:pPr>
             <w:r>
               <w:rPr>
                 <w:b/>
               </w:rPr>
-              <w:t>Nhóm cấu hình</w:t>
+              <w:t>Thành phần</w:t>
             </w:r>
           </w:p>
         </w:tc>
@@ -403,14 +110,11 @@
             <w:shd w:fill="D9EAF7"/>
           </w:tcPr>
           <w:p>
-            <w:pPr>
-              <w:jc w:val="left"/>
-            </w:pPr>
             <w:r>
               <w:rPr>
                 <w:b/>
               </w:rPr>
-              <w:t>Nội dung cần kiểm tra</w:t>
+              <w:t>Chức năng</w:t>
             </w:r>
           </w:p>
         </w:tc>
@@ -421,14 +125,8 @@
             <w:tcW w:type="dxa" w:w="4986"/>
           </w:tcPr>
           <w:p>
-            <w:pPr>
-              <w:jc w:val="left"/>
-            </w:pPr>
             <w:r>
-              <w:rPr>
-                <w:b w:val="0"/>
-              </w:rPr>
-              <w:t>PostgreSQL</w:t>
+              <w:t>main.py</w:t>
             </w:r>
           </w:p>
         </w:tc>
@@ -437,14 +135,8 @@
             <w:tcW w:type="dxa" w:w="4986"/>
           </w:tcPr>
           <w:p>
-            <w:pPr>
-              <w:jc w:val="left"/>
-            </w:pPr>
             <w:r>
-              <w:rPr>
-                <w:b w:val="0"/>
-              </w:rPr>
-              <w:t>Host, port, database, tài khoản chỉ đọc và thời gian chờ kết nối.</w:t>
+              <w:t>Mã nguồn chính; hỗ trợ giao diện Windows và dòng lệnh.</w:t>
             </w:r>
           </w:p>
         </w:tc>
@@ -455,14 +147,8 @@
             <w:tcW w:type="dxa" w:w="4986"/>
           </w:tcPr>
           <w:p>
-            <w:pPr>
-              <w:jc w:val="left"/>
-            </w:pPr>
             <w:r>
-              <w:rPr>
-                <w:b w:val="0"/>
-              </w:rPr>
-              <w:t>Oracle</w:t>
+              <w:t>TracksSync.sample.json</w:t>
             </w:r>
           </w:p>
         </w:tc>
@@ -471,14 +157,8 @@
             <w:tcW w:type="dxa" w:w="4986"/>
           </w:tcPr>
           <w:p>
-            <w:pPr>
-              <w:jc w:val="left"/>
-            </w:pPr>
             <w:r>
-              <w:rPr>
-                <w:b w:val="0"/>
-              </w:rPr>
-              <w:t>Host, port, service, quyền đọc T_DAY_FLIGHTS_GOINGON và ghi T_TRACKS_LOG cho TracksSync.</w:t>
+              <w:t>Cấu hình mẫu PostgreSQL, Oracle, FIR và watermark.</w:t>
             </w:r>
           </w:p>
         </w:tc>
@@ -489,14 +169,8 @@
             <w:tcW w:type="dxa" w:w="4986"/>
           </w:tcPr>
           <w:p>
-            <w:pPr>
-              <w:jc w:val="left"/>
-            </w:pPr>
             <w:r>
-              <w:rPr>
-                <w:b w:val="0"/>
-              </w:rPr>
-              <w:t>FIR</w:t>
+              <w:t>ATFM-TracksSync.exe</w:t>
             </w:r>
           </w:p>
         </w:tc>
@@ -505,14 +179,8 @@
             <w:tcW w:type="dxa" w:w="4986"/>
           </w:tcPr>
           <w:p>
-            <w:pPr>
-              <w:jc w:val="left"/>
-            </w:pPr>
             <w:r>
-              <w:rPr>
-                <w:b w:val="0"/>
-              </w:rPr>
-              <w:t>Đường dẫn tuyệt đối tới file GeoJSON chứa vùng VVHN và VVHM, tài khoản chạy tool có quyền đọc.</w:t>
+              <w:t>Bản giao diện Windows sau khi build.</w:t>
             </w:r>
           </w:p>
         </w:tc>
@@ -523,14 +191,8 @@
             <w:tcW w:type="dxa" w:w="4986"/>
           </w:tcPr>
           <w:p>
-            <w:pPr>
-              <w:jc w:val="left"/>
-            </w:pPr>
             <w:r>
-              <w:rPr>
-                <w:b w:val="0"/>
-              </w:rPr>
-              <w:t>Watermark</w:t>
+              <w:t>ATFM-TracksSync-CLI.exe</w:t>
             </w:r>
           </w:p>
         </w:tc>
@@ -539,77 +201,19 @@
             <w:tcW w:type="dxa" w:w="4986"/>
           </w:tcPr>
           <w:p>
-            <w:pPr>
-              <w:jc w:val="left"/>
-            </w:pPr>
             <w:r>
-              <w:rPr>
-                <w:b w:val="0"/>
-              </w:rPr>
-              <w:t>Đường dẫn file mốc đồng bộ; để trống để tool tự đặt cạnh chương trình.</w:t>
-            </w:r>
-          </w:p>
-        </w:tc>
-      </w:tr>
-      <w:tr>
-        <w:tc>
-          <w:tcPr>
-            <w:tcW w:type="dxa" w:w="4986"/>
-          </w:tcPr>
-          <w:p>
-            <w:pPr>
-              <w:jc w:val="left"/>
-            </w:pPr>
-            <w:r>
-              <w:rPr>
-                <w:b w:val="0"/>
-              </w:rPr>
-              <w:t>API</w:t>
-            </w:r>
-          </w:p>
-        </w:tc>
-        <w:tc>
-          <w:tcPr>
-            <w:tcW w:type="dxa" w:w="4986"/>
-          </w:tcPr>
-          <w:p>
-            <w:pPr>
-              <w:jc w:val="left"/>
-            </w:pPr>
-            <w:r>
-              <w:rPr>
-                <w:b w:val="0"/>
-              </w:rPr>
-              <w:t>Host/port dịch vụ; port mặc định 5088. Chỉ cho phép mạng nội bộ truy cập qua firewall.</w:t>
+              <w:t>Bản CLI dùng cho Task Scheduler.</w:t>
             </w:r>
           </w:p>
         </w:tc>
       </w:tr>
     </w:tbl>
     <w:p>
-      <w:r>
-        <w:t>Không ghi mật khẩu thật trong file hướng dẫn, ảnh chụp màn hình, log gửi hỗ trợ hoặc package ZIP. Sau khi thay đổi cấu hình, luôn chạy kiểm tra trước khi bật đồng bộ tự động.</w:t>
-      </w:r>
-    </w:p>
-    <w:p>
       <w:pPr>
         <w:pStyle w:val="Heading1"/>
       </w:pPr>
       <w:r>
-        <w:t>3. Màn hình TracksSync</w:t>
-      </w:r>
-    </w:p>
-    <w:p>
-      <w:r>
-        <w:t>Mở ATFM-TracksSync.exe. Giao diện có vùng log và năm thao tác: Kiểm tra đối chiếu, Ghi T_TRACKS_LOG, Xác minh kết quả, Auto và Stop. Chu kỳ là khoảng nghỉ sau khi một lượt hoàn tất, phải là số nguyên dương.</w:t>
-      </w:r>
-    </w:p>
-    <w:p>
-      <w:pPr>
-        <w:pStyle w:val="Heading2"/>
-      </w:pPr>
-      <w:r>
-        <w:t>3.1 Kiểm tra đối chiếu và ghi dữ liệu</w:t>
+        <w:t>1. Chuẩn bị và cấu hình</w:t>
       </w:r>
     </w:p>
     <w:p>
@@ -617,7 +221,7 @@
         <w:pStyle w:val="ListBullet"/>
       </w:pPr>
       <w:r>
-        <w:t>Bấm Kiểm tra đối chiếu trước. Tool đọc public.tracks, loại điểm ngoài FIR, chuẩn hóa callsign và đối chiếu chuyến bay Oracle nhưng chưa ghi dữ liệu nghiệp vụ.</w:t>
+        <w:t>Máy chạy phải kết nối được PostgreSQL, Oracle và file GeoJSON ranh giới FIR VVHN/VVHM.</w:t>
       </w:r>
     </w:p>
     <w:p>
@@ -625,7 +229,7 @@
         <w:pStyle w:val="ListBullet"/>
       </w:pPr>
       <w:r>
-        <w:t>Đọc log để xác nhận đúng file cấu hình, kết nối PostgreSQL/Oracle, số callsign/ngày đối chiếu và các trường hợp bị bỏ qua.</w:t>
+        <w:t>PostgreSQL cần quyền đọc public.tracks; Oracle cần đọc T_DAY_FLIGHTS_GOINGON và ghi T_TRACKS_LOG.</w:t>
       </w:r>
     </w:p>
     <w:p>
@@ -633,7 +237,7 @@
         <w:pStyle w:val="ListBullet"/>
       </w:pPr>
       <w:r>
-        <w:t>Bấm Ghi T_TRACKS_LOG khi kết quả kiểm tra hợp lệ. Tool MERGE theo khóa CALLSIGN + DATE, cập nhật vị trí mới nhất và chỉ ghi watermark sau khi đồng bộ thành công.</w:t>
+        <w:t>Không đưa TracksSync.local.json hoặc file watermark lên Git.</w:t>
       </w:r>
     </w:p>
     <w:p>
@@ -641,22 +245,18 @@
         <w:pStyle w:val="ListBullet"/>
       </w:pPr>
       <w:r>
-        <w:t>Bấm Xác minh kết quả để nhận thống kê đúng, sai, thiếu, thừa và trùng khóa. Một lượt bình thường không có traceback; sai, thiếu và trùng khóa phải bằng 0.</w:t>
+        <w:t>Không chạy chồng nhiều phiên TracksSync trên cùng T_TRACKS_LOG hoặc watermark.</w:t>
       </w:r>
     </w:p>
     <w:p>
-      <w:pPr>
-        <w:pStyle w:val="Heading2"/>
-      </w:pPr>
       <w:r>
-        <w:t>3.2 Quy tắc dữ liệu chính</w:t>
+        <w:t>Thứ tự tìm cấu hình: TRACKS_CONFIG, TracksSync.local.json cạnh mã nguồn/EXE, rồi prjApplication\App_Data\TracksSync.local.json.</w:t>
       </w:r>
     </w:p>
     <w:tbl>
       <w:tblPr>
         <w:tblStyle w:val="TableGrid"/>
         <w:tblW w:type="auto" w:w="0"/>
-        <w:tblLayout w:type="autofit"/>
         <w:tblLook w:firstColumn="1" w:firstRow="1" w:lastColumn="0" w:lastRow="0" w:noHBand="0" w:noVBand="1" w:val="04A0"/>
       </w:tblPr>
       <w:tblGrid>
@@ -670,9 +270,148 @@
             <w:shd w:fill="D9EAF7"/>
           </w:tcPr>
           <w:p>
-            <w:pPr>
-              <w:jc w:val="left"/>
-            </w:pPr>
+            <w:r>
+              <w:rPr>
+                <w:b/>
+              </w:rPr>
+              <w:t>Nhóm</w:t>
+            </w:r>
+          </w:p>
+        </w:tc>
+        <w:tc>
+          <w:tcPr>
+            <w:tcW w:type="dxa" w:w="4986"/>
+            <w:shd w:fill="D9EAF7"/>
+          </w:tcPr>
+          <w:p>
+            <w:r>
+              <w:rPr>
+                <w:b/>
+              </w:rPr>
+              <w:t>Nội dung</w:t>
+            </w:r>
+          </w:p>
+        </w:tc>
+      </w:tr>
+      <w:tr>
+        <w:tc>
+          <w:tcPr>
+            <w:tcW w:type="dxa" w:w="4986"/>
+          </w:tcPr>
+          <w:p>
+            <w:r>
+              <w:t>postgres</w:t>
+            </w:r>
+          </w:p>
+        </w:tc>
+        <w:tc>
+          <w:tcPr>
+            <w:tcW w:type="dxa" w:w="4986"/>
+          </w:tcPr>
+          <w:p>
+            <w:r>
+              <w:t>host, port, database, username, password; nguồn public.tracks.</w:t>
+            </w:r>
+          </w:p>
+        </w:tc>
+      </w:tr>
+      <w:tr>
+        <w:tc>
+          <w:tcPr>
+            <w:tcW w:type="dxa" w:w="4986"/>
+          </w:tcPr>
+          <w:p>
+            <w:r>
+              <w:t>oracle</w:t>
+            </w:r>
+          </w:p>
+        </w:tc>
+        <w:tc>
+          <w:tcPr>
+            <w:tcW w:type="dxa" w:w="4986"/>
+          </w:tcPr>
+          <w:p>
+            <w:r>
+              <w:t>host, port, service_name, tài khoản và T_DAY_FLIGHTS_GOINGON.</w:t>
+            </w:r>
+          </w:p>
+        </w:tc>
+      </w:tr>
+      <w:tr>
+        <w:tc>
+          <w:tcPr>
+            <w:tcW w:type="dxa" w:w="4986"/>
+          </w:tcPr>
+          <w:p>
+            <w:r>
+              <w:t>fir</w:t>
+            </w:r>
+          </w:p>
+        </w:tc>
+        <w:tc>
+          <w:tcPr>
+            <w:tcW w:type="dxa" w:w="4986"/>
+          </w:tcPr>
+          <w:p>
+            <w:r>
+              <w:t>geojson_path tuyệt đối đến file vùng VVHN/VVHM.</w:t>
+            </w:r>
+          </w:p>
+        </w:tc>
+      </w:tr>
+      <w:tr>
+        <w:tc>
+          <w:tcPr>
+            <w:tcW w:type="dxa" w:w="4986"/>
+          </w:tcPr>
+          <w:p>
+            <w:r>
+              <w:t>watermark_path</w:t>
+            </w:r>
+          </w:p>
+        </w:tc>
+        <w:tc>
+          <w:tcPr>
+            <w:tcW w:type="dxa" w:w="4986"/>
+          </w:tcPr>
+          <w:p>
+            <w:r>
+              <w:t>Mốc dữ liệu đã đồng bộ; để trống để tool tự đặt cạnh chương trình.</w:t>
+            </w:r>
+          </w:p>
+        </w:tc>
+      </w:tr>
+    </w:tbl>
+    <w:p>
+      <w:pPr>
+        <w:pStyle w:val="Heading1"/>
+      </w:pPr>
+      <w:r>
+        <w:t>2. Luồng xử lý dữ liệu</w:t>
+      </w:r>
+    </w:p>
+    <w:p>
+      <w:r>
+        <w:t>Luồng chuẩn: public.tracks -&gt; lọc FIR VVHN/VVHM -&gt; chuẩn hóa callsign -&gt; T_DAY_FLIGHTS_GOINGON -&gt; T_TRACKS_LOG -&gt; watermark.</w:t>
+      </w:r>
+    </w:p>
+    <w:tbl>
+      <w:tblPr>
+        <w:tblStyle w:val="TableGrid"/>
+        <w:tblW w:type="auto" w:w="0"/>
+        <w:tblLook w:firstColumn="1" w:firstRow="1" w:lastColumn="0" w:lastRow="0" w:noHBand="0" w:noVBand="1" w:val="04A0"/>
+      </w:tblPr>
+      <w:tblGrid>
+        <w:gridCol w:w="4986"/>
+        <w:gridCol w:w="4986"/>
+      </w:tblGrid>
+      <w:tr>
+        <w:tc>
+          <w:tcPr>
+            <w:tcW w:type="dxa" w:w="4986"/>
+            <w:shd w:fill="D9EAF7"/>
+          </w:tcPr>
+          <w:p>
             <w:r>
               <w:rPr>
                 <w:b/>
@@ -687,14 +426,11 @@
             <w:shd w:fill="D9EAF7"/>
           </w:tcPr>
           <w:p>
-            <w:pPr>
-              <w:jc w:val="left"/>
-            </w:pPr>
             <w:r>
               <w:rPr>
                 <w:b/>
               </w:rPr>
-              <w:t>Cách xử lý của tool</w:t>
+              <w:t>Cách xử lý</w:t>
             </w:r>
           </w:p>
         </w:tc>
@@ -705,13 +441,7 @@
             <w:tcW w:type="dxa" w:w="4986"/>
           </w:tcPr>
           <w:p>
-            <w:pPr>
-              <w:jc w:val="left"/>
-            </w:pPr>
             <w:r>
-              <w:rPr>
-                <w:b w:val="0"/>
-              </w:rPr>
               <w:t>Callsign</w:t>
             </w:r>
           </w:p>
@@ -721,14 +451,8 @@
             <w:tcW w:type="dxa" w:w="4986"/>
           </w:tcPr>
           <w:p>
-            <w:pPr>
-              <w:jc w:val="left"/>
-            </w:pPr>
             <w:r>
-              <w:rPr>
-                <w:b w:val="0"/>
-              </w:rPr>
-              <w:t>Lấy phần trước dấu gạch nối của flight_id_current, bỏ khoảng trắng và chuyển sang chữ hoa.</w:t>
+              <w:t>Lấy phần trước dấu gạch nối của flight_id_current, bỏ khoảng trắng và chuyển chữ hoa.</w:t>
             </w:r>
           </w:p>
         </w:tc>
@@ -739,13 +463,7 @@
             <w:tcW w:type="dxa" w:w="4986"/>
           </w:tcPr>
           <w:p>
-            <w:pPr>
-              <w:jc w:val="left"/>
-            </w:pPr>
             <w:r>
-              <w:rPr>
-                <w:b w:val="0"/>
-              </w:rPr>
               <w:t>FIR</w:t>
             </w:r>
           </w:p>
@@ -755,14 +473,8 @@
             <w:tcW w:type="dxa" w:w="4986"/>
           </w:tcPr>
           <w:p>
-            <w:pPr>
-              <w:jc w:val="left"/>
-            </w:pPr>
             <w:r>
-              <w:rPr>
-                <w:b w:val="0"/>
-              </w:rPr>
-              <w:t>VVHN hoặc biên chung có STATUS=1; VVHM có STATUS=2; ngoài hai FIR bị loại.</w:t>
+              <w:t>VVHN hoặc biên chung có STATUS=1; VVHM có STATUS=2; ngoài FIR bị loại.</w:t>
             </w:r>
           </w:p>
         </w:tc>
@@ -773,14 +485,8 @@
             <w:tcW w:type="dxa" w:w="4986"/>
           </w:tcPr>
           <w:p>
-            <w:pPr>
-              <w:jc w:val="left"/>
-            </w:pPr>
             <w:r>
-              <w:rPr>
-                <w:b w:val="0"/>
-              </w:rPr>
-              <w:t>Đối chiếu chuyến bay</w:t>
+              <w:t>Đối chiếu</w:t>
             </w:r>
           </w:p>
         </w:tc>
@@ -789,14 +495,8 @@
             <w:tcW w:type="dxa" w:w="4986"/>
           </w:tcPr>
           <w:p>
-            <w:pPr>
-              <w:jc w:val="left"/>
-            </w:pPr>
             <w:r>
-              <w:rPr>
-                <w:b w:val="0"/>
-              </w:rPr>
-              <w:t>Tìm CALLSIGN + ngày trong T_DAY_FLIGHTS_GOINGON; trường hợp nhiều dòng dùng khoảng ETD-ETA, kể cả qua nửa đêm.</w:t>
+              <w:t>Ghép CALLSIGN + ngày; nếu trùng, chọn duy nhất khoảng ETD-ETA chứa thời điểm track.</w:t>
             </w:r>
           </w:p>
         </w:tc>
@@ -807,14 +507,8 @@
             <w:tcW w:type="dxa" w:w="4986"/>
           </w:tcPr>
           <w:p>
-            <w:pPr>
-              <w:jc w:val="left"/>
-            </w:pPr>
             <w:r>
-              <w:rPr>
-                <w:b w:val="0"/>
-              </w:rPr>
-              <w:t>Không match</w:t>
+              <w:t>Không ghép được</w:t>
             </w:r>
           </w:p>
         </w:tc>
@@ -823,14 +517,8 @@
             <w:tcW w:type="dxa" w:w="4986"/>
           </w:tcPr>
           <w:p>
-            <w:pPr>
-              <w:jc w:val="left"/>
-            </w:pPr>
             <w:r>
-              <w:rPr>
-                <w:b w:val="0"/>
-              </w:rPr>
-              <w:t>Vẫn ghi bản ghi đủ điều kiện với PERMTYPE=OTHER, thông tin hành trình để trống.</w:t>
+              <w:t>Vẫn ghi bản ghi đủ điều kiện với PERMTYPE=OTHER.</w:t>
             </w:r>
           </w:p>
         </w:tc>
@@ -841,14 +529,8 @@
             <w:tcW w:type="dxa" w:w="4986"/>
           </w:tcPr>
           <w:p>
-            <w:pPr>
-              <w:jc w:val="left"/>
-            </w:pPr>
             <w:r>
-              <w:rPr>
-                <w:b w:val="0"/>
-              </w:rPr>
-              <w:t>Thời điểm FIR</w:t>
+              <w:t>Bản ghi cũ</w:t>
             </w:r>
           </w:p>
         </w:tc>
@@ -857,14 +539,8 @@
             <w:tcW w:type="dxa" w:w="4986"/>
           </w:tcPr>
           <w:p>
-            <w:pPr>
-              <w:jc w:val="left"/>
-            </w:pPr>
             <w:r>
-              <w:rPr>
-                <w:b w:val="0"/>
-              </w:rPr>
-              <w:t>Giữ TIME_IN sớm nhất; TIME_OUT là lần đầu đổi FIR sau đó, nếu có.</w:t>
+              <w:t>Cập nhật tọa độ/thời gian mới nhất và giữ TIME_IN/TIME_OUT đã ghi.</w:t>
             </w:r>
           </w:p>
         </w:tc>
@@ -875,14 +551,8 @@
             <w:tcW w:type="dxa" w:w="4986"/>
           </w:tcPr>
           <w:p>
-            <w:pPr>
-              <w:jc w:val="left"/>
-            </w:pPr>
             <w:r>
-              <w:rPr>
-                <w:b w:val="0"/>
-              </w:rPr>
-              <w:t>Bản ghi cũ</w:t>
+              <w:t>Watermark</w:t>
             </w:r>
           </w:p>
         </w:tc>
@@ -891,14 +561,8 @@
             <w:tcW w:type="dxa" w:w="4986"/>
           </w:tcPr>
           <w:p>
-            <w:pPr>
-              <w:jc w:val="left"/>
-            </w:pPr>
             <w:r>
-              <w:rPr>
-                <w:b w:val="0"/>
-              </w:rPr>
-              <w:t>Cập nhật tọa độ/thời gian mới nhất; có thể bổ sung metadata khi bản ghi OTHER được match ở lượt sau.</w:t>
+              <w:t>Chỉ cập nhật sau sync thành công để lượt sau chỉ đọc dữ liệu mới hơn.</w:t>
             </w:r>
           </w:p>
         </w:tc>
@@ -909,19 +573,18 @@
         <w:pStyle w:val="Heading1"/>
       </w:pPr>
       <w:r>
-        <w:t>4. Chạy tự động và dòng lệnh</w:t>
+        <w:t>3. Vận hành bằng giao diện Windows</w:t>
       </w:r>
     </w:p>
     <w:p>
       <w:r>
-        <w:t>Auto thực hiện check -&gt; sync -&gt; verify trên cùng tập dữ liệu, sau đó mới đếm ngược tới lượt tiếp theo. Nút Stop yêu cầu dừng vòng Auto; lượt đang thao tác cơ sở dữ liệu sẽ hoàn tất an toàn trước khi dừng.</w:t>
+        <w:t>Mở tools\dist\ATFM-TracksSync.exe hoặc chạy python .\tools\TracksSyncPython\main.py.</w:t>
       </w:r>
     </w:p>
     <w:tbl>
       <w:tblPr>
         <w:tblStyle w:val="TableGrid"/>
         <w:tblW w:type="auto" w:w="0"/>
-        <w:tblLayout w:type="autofit"/>
         <w:tblLook w:firstColumn="1" w:firstRow="1" w:lastColumn="0" w:lastRow="0" w:noHBand="0" w:noVBand="1" w:val="04A0"/>
       </w:tblPr>
       <w:tblGrid>
@@ -935,14 +598,11 @@
             <w:shd w:fill="D9EAF7"/>
           </w:tcPr>
           <w:p>
-            <w:pPr>
-              <w:jc w:val="left"/>
-            </w:pPr>
             <w:r>
               <w:rPr>
                 <w:b/>
               </w:rPr>
-              <w:t>Lệnh/chế độ</w:t>
+              <w:t>Nút</w:t>
             </w:r>
           </w:p>
         </w:tc>
@@ -952,9 +612,170 @@
             <w:shd w:fill="D9EAF7"/>
           </w:tcPr>
           <w:p>
-            <w:pPr>
-              <w:jc w:val="left"/>
-            </w:pPr>
+            <w:r>
+              <w:rPr>
+                <w:b/>
+              </w:rPr>
+              <w:t>Thao tác</w:t>
+            </w:r>
+          </w:p>
+        </w:tc>
+      </w:tr>
+      <w:tr>
+        <w:tc>
+          <w:tcPr>
+            <w:tcW w:type="dxa" w:w="4986"/>
+          </w:tcPr>
+          <w:p>
+            <w:r>
+              <w:t>Kiểm tra đối chiếu</w:t>
+            </w:r>
+          </w:p>
+        </w:tc>
+        <w:tc>
+          <w:tcPr>
+            <w:tcW w:type="dxa" w:w="4986"/>
+          </w:tcPr>
+          <w:p>
+            <w:r>
+              <w:t>Đọc và đối chiếu dữ liệu; không ghi dữ liệu nghiệp vụ hoặc watermark.</w:t>
+            </w:r>
+          </w:p>
+        </w:tc>
+      </w:tr>
+      <w:tr>
+        <w:tc>
+          <w:tcPr>
+            <w:tcW w:type="dxa" w:w="4986"/>
+          </w:tcPr>
+          <w:p>
+            <w:r>
+              <w:t>Ghi T_TRACKS_LOG</w:t>
+            </w:r>
+          </w:p>
+        </w:tc>
+        <w:tc>
+          <w:tcPr>
+            <w:tcW w:type="dxa" w:w="4986"/>
+          </w:tcPr>
+          <w:p>
+            <w:r>
+              <w:t>Ghi mới/cập nhật T_TRACKS_LOG và cập nhật watermark.</w:t>
+            </w:r>
+          </w:p>
+        </w:tc>
+      </w:tr>
+      <w:tr>
+        <w:tc>
+          <w:tcPr>
+            <w:tcW w:type="dxa" w:w="4986"/>
+          </w:tcPr>
+          <w:p>
+            <w:r>
+              <w:t>Xác minh kết quả</w:t>
+            </w:r>
+          </w:p>
+        </w:tc>
+        <w:tc>
+          <w:tcPr>
+            <w:tcW w:type="dxa" w:w="4986"/>
+          </w:tcPr>
+          <w:p>
+            <w:r>
+              <w:t>Thống kê đúng, sai, thiếu, thừa và khóa trùng sau khi ghi.</w:t>
+            </w:r>
+          </w:p>
+        </w:tc>
+      </w:tr>
+      <w:tr>
+        <w:tc>
+          <w:tcPr>
+            <w:tcW w:type="dxa" w:w="4986"/>
+          </w:tcPr>
+          <w:p>
+            <w:r>
+              <w:t>Auto</w:t>
+            </w:r>
+          </w:p>
+        </w:tc>
+        <w:tc>
+          <w:tcPr>
+            <w:tcW w:type="dxa" w:w="4986"/>
+          </w:tcPr>
+          <w:p>
+            <w:r>
+              <w:t>Lặp check -&gt; sync -&gt; verify theo chu kỳ đã nhập.</w:t>
+            </w:r>
+          </w:p>
+        </w:tc>
+      </w:tr>
+      <w:tr>
+        <w:tc>
+          <w:tcPr>
+            <w:tcW w:type="dxa" w:w="4986"/>
+          </w:tcPr>
+          <w:p>
+            <w:r>
+              <w:t>Stop</w:t>
+            </w:r>
+          </w:p>
+        </w:tc>
+        <w:tc>
+          <w:tcPr>
+            <w:tcW w:type="dxa" w:w="4986"/>
+          </w:tcPr>
+          <w:p>
+            <w:r>
+              <w:t>Dừng Auto sau khi lượt thao tác cơ sở dữ liệu hiện tại hoàn tất an toàn.</w:t>
+            </w:r>
+          </w:p>
+        </w:tc>
+      </w:tr>
+    </w:tbl>
+    <w:p>
+      <w:r>
+        <w:t>Quy trình khuyến nghị: Kiểm tra đối chiếu -&gt; đọc log -&gt; Ghi T_TRACKS_LOG -&gt; Xác minh kết quả. Chỉ bật Auto sau khi một lượt thủ công hoàn tất bình thường.</w:t>
+      </w:r>
+    </w:p>
+    <w:p>
+      <w:pPr>
+        <w:pStyle w:val="Heading1"/>
+      </w:pPr>
+      <w:r>
+        <w:t>4. Vận hành bằng dòng lệnh</w:t>
+      </w:r>
+    </w:p>
+    <w:tbl>
+      <w:tblPr>
+        <w:tblStyle w:val="TableGrid"/>
+        <w:tblW w:type="auto" w:w="0"/>
+        <w:tblLook w:firstColumn="1" w:firstRow="1" w:lastColumn="0" w:lastRow="0" w:noHBand="0" w:noVBand="1" w:val="04A0"/>
+      </w:tblPr>
+      <w:tblGrid>
+        <w:gridCol w:w="4986"/>
+        <w:gridCol w:w="4986"/>
+      </w:tblGrid>
+      <w:tr>
+        <w:tc>
+          <w:tcPr>
+            <w:tcW w:type="dxa" w:w="4986"/>
+            <w:shd w:fill="D9EAF7"/>
+          </w:tcPr>
+          <w:p>
+            <w:r>
+              <w:rPr>
+                <w:b/>
+              </w:rPr>
+              <w:t>Lệnh</w:t>
+            </w:r>
+          </w:p>
+        </w:tc>
+        <w:tc>
+          <w:tcPr>
+            <w:tcW w:type="dxa" w:w="4986"/>
+            <w:shd w:fill="D9EAF7"/>
+          </w:tcPr>
+          <w:p>
             <w:r>
               <w:rPr>
                 <w:b/>
@@ -970,13 +791,7 @@
             <w:tcW w:type="dxa" w:w="4986"/>
           </w:tcPr>
           <w:p>
-            <w:pPr>
-              <w:jc w:val="left"/>
-            </w:pPr>
             <w:r>
-              <w:rPr>
-                <w:b w:val="0"/>
-              </w:rPr>
               <w:t>--mode check</w:t>
             </w:r>
           </w:p>
@@ -986,14 +801,8 @@
             <w:tcW w:type="dxa" w:w="4986"/>
           </w:tcPr>
           <w:p>
-            <w:pPr>
-              <w:jc w:val="left"/>
-            </w:pPr>
             <w:r>
-              <w:rPr>
-                <w:b w:val="0"/>
-              </w:rPr>
-              <w:t>Đọc và đối chiếu, không ghi log nghiệp vụ hoặc watermark.</w:t>
+              <w:t>Đọc, phân vùng và đối chiếu; không ghi log nghiệp vụ.</w:t>
             </w:r>
           </w:p>
         </w:tc>
@@ -1004,13 +813,7 @@
             <w:tcW w:type="dxa" w:w="4986"/>
           </w:tcPr>
           <w:p>
-            <w:pPr>
-              <w:jc w:val="left"/>
-            </w:pPr>
             <w:r>
-              <w:rPr>
-                <w:b w:val="0"/>
-              </w:rPr>
               <w:t>--mode sync</w:t>
             </w:r>
           </w:p>
@@ -1020,14 +823,8 @@
             <w:tcW w:type="dxa" w:w="4986"/>
           </w:tcPr>
           <w:p>
-            <w:pPr>
-              <w:jc w:val="left"/>
-            </w:pPr>
             <w:r>
-              <w:rPr>
-                <w:b w:val="0"/>
-              </w:rPr>
-              <w:t>Ghi/cập nhật T_TRACKS_LOG và cập nhật watermark.</w:t>
+              <w:t>Ghi/cập nhật T_TRACKS_LOG và watermark.</w:t>
             </w:r>
           </w:p>
         </w:tc>
@@ -1038,13 +835,7 @@
             <w:tcW w:type="dxa" w:w="4986"/>
           </w:tcPr>
           <w:p>
-            <w:pPr>
-              <w:jc w:val="left"/>
-            </w:pPr>
             <w:r>
-              <w:rPr>
-                <w:b w:val="0"/>
-              </w:rPr>
               <w:t>--mode verify</w:t>
             </w:r>
           </w:p>
@@ -1054,14 +845,8 @@
             <w:tcW w:type="dxa" w:w="4986"/>
           </w:tcPr>
           <w:p>
-            <w:pPr>
-              <w:jc w:val="left"/>
-            </w:pPr>
             <w:r>
-              <w:rPr>
-                <w:b w:val="0"/>
-              </w:rPr>
-              <w:t>Đối chiếu dữ liệu dự kiến với Oracle, không cập nhật watermark.</w:t>
+              <w:t>Kiểm tra dữ liệu dự kiến với Oracle; không cập nhật watermark.</w:t>
             </w:r>
           </w:p>
         </w:tc>
@@ -1072,13 +857,7 @@
             <w:tcW w:type="dxa" w:w="4986"/>
           </w:tcPr>
           <w:p>
-            <w:pPr>
-              <w:jc w:val="left"/>
-            </w:pPr>
             <w:r>
-              <w:rPr>
-                <w:b w:val="0"/>
-              </w:rPr>
               <w:t>--mode all</w:t>
             </w:r>
           </w:p>
@@ -1088,13 +867,7 @@
             <w:tcW w:type="dxa" w:w="4986"/>
           </w:tcPr>
           <w:p>
-            <w:pPr>
-              <w:jc w:val="left"/>
-            </w:pPr>
             <w:r>
-              <w:rPr>
-                <w:b w:val="0"/>
-              </w:rPr>
               <w:t>Chạy tuần tự check, sync và verify.</w:t>
             </w:r>
           </w:p>
@@ -1106,13 +879,7 @@
             <w:tcW w:type="dxa" w:w="4986"/>
           </w:tcPr>
           <w:p>
-            <w:pPr>
-              <w:jc w:val="left"/>
-            </w:pPr>
             <w:r>
-              <w:rPr>
-                <w:b w:val="0"/>
-              </w:rPr>
               <w:t>--full</w:t>
             </w:r>
           </w:p>
@@ -1122,14 +889,8 @@
             <w:tcW w:type="dxa" w:w="4986"/>
           </w:tcPr>
           <w:p>
-            <w:pPr>
-              <w:jc w:val="left"/>
-            </w:pPr>
             <w:r>
-              <w:rPr>
-                <w:b w:val="0"/>
-              </w:rPr>
-              <w:t>Bỏ qua watermark để quét lại toàn bộ; chỉ dùng khi chạy lần đầu, backfill hoặc xử lý watermark sai.</w:t>
+              <w:t>Bỏ watermark để quét lại toàn bộ; dùng khi backfill hoặc sửa watermark.</w:t>
             </w:r>
           </w:p>
         </w:tc>
@@ -1137,7 +898,7 @@
     </w:tbl>
     <w:p>
       <w:r>
-        <w:t>Ví dụ chạy qua Task Scheduler: Program/script là ATFM-TracksSync-CLI.exe, Arguments là --mode all, Start in là thư mục chứa EXE và TracksSync.local.json.</w:t>
+        <w:t>Ví dụ: ATFM-TracksSync-CLI.exe --mode all. Trước sync --full hoặc all --full trên môi trường thật, dừng Auto, sao lưu/đánh giá dữ liệu và chạy check --full trước.</w:t>
       </w:r>
     </w:p>
     <w:p>
@@ -1145,248 +906,12 @@
         <w:pStyle w:val="Heading1"/>
       </w:pPr>
       <w:r>
-        <w:t>5. Flight Tracking API</w:t>
+        <w:t>5. Kết quả khai thác</w:t>
       </w:r>
     </w:p>
     <w:p>
       <w:r>
-        <w:t>Flight Tracking API chạy độc lập trên máy có quyền đọc PostgreSQL, giúp IIS chỉ cần gọi HTTP nội bộ. Sau khi khởi động bản EXE nền, dùng các địa chỉ kiểm tra bên dưới; thay 127.0.0.1 bằng IP máy API khi kiểm tra từ máy được phép khác.</w:t>
-      </w:r>
-    </w:p>
-    <w:tbl>
-      <w:tblPr>
-        <w:tblStyle w:val="TableGrid"/>
-        <w:tblW w:type="auto" w:w="0"/>
-        <w:tblLayout w:type="autofit"/>
-        <w:tblLook w:firstColumn="1" w:firstRow="1" w:lastColumn="0" w:lastRow="0" w:noHBand="0" w:noVBand="1" w:val="04A0"/>
-      </w:tblPr>
-      <w:tblGrid>
-        <w:gridCol w:w="4986"/>
-        <w:gridCol w:w="4986"/>
-      </w:tblGrid>
-      <w:tr>
-        <w:tc>
-          <w:tcPr>
-            <w:tcW w:type="dxa" w:w="4986"/>
-            <w:shd w:fill="D9EAF7"/>
-          </w:tcPr>
-          <w:p>
-            <w:pPr>
-              <w:jc w:val="left"/>
-            </w:pPr>
-            <w:r>
-              <w:rPr>
-                <w:b/>
-              </w:rPr>
-              <w:t>Địa chỉ</w:t>
-            </w:r>
-          </w:p>
-        </w:tc>
-        <w:tc>
-          <w:tcPr>
-            <w:tcW w:type="dxa" w:w="4986"/>
-            <w:shd w:fill="D9EAF7"/>
-          </w:tcPr>
-          <w:p>
-            <w:pPr>
-              <w:jc w:val="left"/>
-            </w:pPr>
-            <w:r>
-              <w:rPr>
-                <w:b/>
-              </w:rPr>
-              <w:t>Kết quả mong đợi</w:t>
-            </w:r>
-          </w:p>
-        </w:tc>
-      </w:tr>
-      <w:tr>
-        <w:tc>
-          <w:tcPr>
-            <w:tcW w:type="dxa" w:w="4986"/>
-          </w:tcPr>
-          <w:p>
-            <w:pPr>
-              <w:jc w:val="left"/>
-            </w:pPr>
-            <w:r>
-              <w:rPr>
-                <w:b w:val="0"/>
-              </w:rPr>
-              <w:t>/health/live</w:t>
-            </w:r>
-          </w:p>
-        </w:tc>
-        <w:tc>
-          <w:tcPr>
-            <w:tcW w:type="dxa" w:w="4986"/>
-          </w:tcPr>
-          <w:p>
-            <w:pPr>
-              <w:jc w:val="left"/>
-            </w:pPr>
-            <w:r>
-              <w:rPr>
-                <w:b w:val="0"/>
-              </w:rPr>
-              <w:t>HTTP 200 và trạng thái ok: tiến trình API đang hoạt động.</w:t>
-            </w:r>
-          </w:p>
-        </w:tc>
-      </w:tr>
-      <w:tr>
-        <w:tc>
-          <w:tcPr>
-            <w:tcW w:type="dxa" w:w="4986"/>
-          </w:tcPr>
-          <w:p>
-            <w:pPr>
-              <w:jc w:val="left"/>
-            </w:pPr>
-            <w:r>
-              <w:rPr>
-                <w:b w:val="0"/>
-              </w:rPr>
-              <w:t>/health/ready</w:t>
-            </w:r>
-          </w:p>
-        </w:tc>
-        <w:tc>
-          <w:tcPr>
-            <w:tcW w:type="dxa" w:w="4986"/>
-          </w:tcPr>
-          <w:p>
-            <w:pPr>
-              <w:jc w:val="left"/>
-            </w:pPr>
-            <w:r>
-              <w:rPr>
-                <w:b w:val="0"/>
-              </w:rPr>
-              <w:t>HTTP 200 khi kết nối PostgreSQL sẵn sàng; HTTP 503 khi chưa sẵn sàng.</w:t>
-            </w:r>
-          </w:p>
-        </w:tc>
-      </w:tr>
-      <w:tr>
-        <w:tc>
-          <w:tcPr>
-            <w:tcW w:type="dxa" w:w="4986"/>
-          </w:tcPr>
-          <w:p>
-            <w:pPr>
-              <w:jc w:val="left"/>
-            </w:pPr>
-            <w:r>
-              <w:rPr>
-                <w:b w:val="0"/>
-              </w:rPr>
-              <w:t>/swagger/</w:t>
-            </w:r>
-          </w:p>
-        </w:tc>
-        <w:tc>
-          <w:tcPr>
-            <w:tcW w:type="dxa" w:w="4986"/>
-          </w:tcPr>
-          <w:p>
-            <w:pPr>
-              <w:jc w:val="left"/>
-            </w:pPr>
-            <w:r>
-              <w:rPr>
-                <w:b w:val="0"/>
-              </w:rPr>
-              <w:t>Mở giao diện Swagger để xem và thử các endpoint.</w:t>
-            </w:r>
-          </w:p>
-        </w:tc>
-      </w:tr>
-      <w:tr>
-        <w:tc>
-          <w:tcPr>
-            <w:tcW w:type="dxa" w:w="4986"/>
-          </w:tcPr>
-          <w:p>
-            <w:pPr>
-              <w:jc w:val="left"/>
-            </w:pPr>
-            <w:r>
-              <w:rPr>
-                <w:b w:val="0"/>
-              </w:rPr>
-              <w:t>/openapi.json</w:t>
-            </w:r>
-          </w:p>
-        </w:tc>
-        <w:tc>
-          <w:tcPr>
-            <w:tcW w:type="dxa" w:w="4986"/>
-          </w:tcPr>
-          <w:p>
-            <w:pPr>
-              <w:jc w:val="left"/>
-            </w:pPr>
-            <w:r>
-              <w:rPr>
-                <w:b w:val="0"/>
-              </w:rPr>
-              <w:t>Trả đặc tả OpenAPI dạng JSON.</w:t>
-            </w:r>
-          </w:p>
-        </w:tc>
-      </w:tr>
-      <w:tr>
-        <w:tc>
-          <w:tcPr>
-            <w:tcW w:type="dxa" w:w="4986"/>
-          </w:tcPr>
-          <w:p>
-            <w:pPr>
-              <w:jc w:val="left"/>
-            </w:pPr>
-            <w:r>
-              <w:rPr>
-                <w:b w:val="0"/>
-              </w:rPr>
-              <w:t>/api/v1/tracks?date=yyyy-MM-dd</w:t>
-            </w:r>
-          </w:p>
-        </w:tc>
-        <w:tc>
-          <w:tcPr>
-            <w:tcW w:type="dxa" w:w="4986"/>
-          </w:tcPr>
-          <w:p>
-            <w:pPr>
-              <w:jc w:val="left"/>
-            </w:pPr>
-            <w:r>
-              <w:rPr>
-                <w:b w:val="0"/>
-              </w:rPr>
-              <w:t>Trả vị trí mới nhất của mỗi callsign trong ngày hợp lệ.</w:t>
-            </w:r>
-          </w:p>
-        </w:tc>
-      </w:tr>
-    </w:tbl>
-    <w:p>
-      <w:r>
-        <w:t>API không dùng X-API-Key. Vì vậy chỉ mở cổng 5088 cho IP máy IIS hoặc mạng vận hành đã được phép; không công bố endpoint trực tiếp ra Internet. Khi thay đổi địa chỉ API, cập nhật FlightTrackingApiBaseUrl và FlightTrackingApiTimeoutSeconds trong cấu hình ATFM Web theo quy trình quản trị hệ thống.</w:t>
-      </w:r>
-    </w:p>
-    <w:p>
-      <w:pPr>
-        <w:pStyle w:val="Heading1"/>
-      </w:pPr>
-      <w:r>
-        <w:t>6. Kết quả khai thác ADS-B</w:t>
-      </w:r>
-    </w:p>
-    <w:p>
-      <w:r>
-        <w:t>Dữ liệu do hai tool xử lý được khai thác trên ATFM Web. Ảnh dưới đây là giao diện thực tế đã lưu trong tài liệu kỹ thuật ADS-B của dự án, dùng để nhận biết đầu ra nghiệp vụ của quy trình.</w:t>
+        <w:t>T_TRACKS_LOG là đầu ra nghiệp vụ của TracksSyncPython, phục vụ báo cáo hiệu suất ADS-B trong ATFM Web.</w:t>
       </w:r>
     </w:p>
     <w:p>
@@ -1405,7 +930,7 @@
               <a:graphicData uri="http://schemas.openxmlformats.org/drawingml/2006/picture">
                 <pic:pic>
                   <pic:nvPicPr>
-                    <pic:cNvPr id="0" name="adsb-screen-1.png"/>
+                    <pic:cNvPr id="0" name="adsb-report.png"/>
                     <pic:cNvPicPr/>
                   </pic:nvPicPr>
                   <pic:blipFill>
@@ -1433,60 +958,7 @@
         <w:jc w:val="center"/>
       </w:pPr>
       <w:r>
-        <w:rPr>
-          <w:i/>
-        </w:rPr>
         <w:t>Hình 1. Báo cáo hiệu suất ADS-B sử dụng dữ liệu T_TRACKS_LOG.</w:t>
-      </w:r>
-    </w:p>
-    <w:p>
-      <w:pPr>
-        <w:jc w:val="center"/>
-      </w:pPr>
-      <w:r>
-        <w:drawing>
-          <wp:inline xmlns:a="http://schemas.openxmlformats.org/drawingml/2006/main" xmlns:pic="http://schemas.openxmlformats.org/drawingml/2006/picture">
-            <wp:extent cx="5688000" cy="5125862"/>
-            <wp:docPr id="2" name="Picture 2"/>
-            <wp:cNvGraphicFramePr>
-              <a:graphicFrameLocks noChangeAspect="1"/>
-            </wp:cNvGraphicFramePr>
-            <a:graphic>
-              <a:graphicData uri="http://schemas.openxmlformats.org/drawingml/2006/picture">
-                <pic:pic>
-                  <pic:nvPicPr>
-                    <pic:cNvPr id="0" name="adsb-screen-2.png"/>
-                    <pic:cNvPicPr/>
-                  </pic:nvPicPr>
-                  <pic:blipFill>
-                    <a:blip r:embed="rId11"/>
-                    <a:stretch>
-                      <a:fillRect/>
-                    </a:stretch>
-                  </pic:blipFill>
-                  <pic:spPr>
-                    <a:xfrm>
-                      <a:off x="0" y="0"/>
-                      <a:ext cx="5688000" cy="5125862"/>
-                    </a:xfrm>
-                    <a:prstGeom prst="rect"/>
-                  </pic:spPr>
-                </pic:pic>
-              </a:graphicData>
-            </a:graphic>
-          </wp:inline>
-        </w:drawing>
-      </w:r>
-    </w:p>
-    <w:p>
-      <w:pPr>
-        <w:jc w:val="center"/>
-      </w:pPr>
-      <w:r>
-        <w:rPr>
-          <w:i/>
-        </w:rPr>
-        <w:t>Hình 2. Bản đồ theo dõi chuyến bay sử dụng Flight Tracking API.</w:t>
       </w:r>
     </w:p>
     <w:p>
@@ -1494,14 +966,13 @@
         <w:pStyle w:val="Heading1"/>
       </w:pPr>
       <w:r>
-        <w:t>7. Xử lý sự cố nhanh</w:t>
+        <w:t>6. Kiểm tra và xử lý sự cố</w:t>
       </w:r>
     </w:p>
     <w:tbl>
       <w:tblPr>
         <w:tblStyle w:val="TableGrid"/>
         <w:tblW w:type="auto" w:w="0"/>
-        <w:tblLayout w:type="autofit"/>
         <w:tblLook w:firstColumn="1" w:firstRow="1" w:lastColumn="0" w:lastRow="0" w:noHBand="0" w:noVBand="1" w:val="04A0"/>
       </w:tblPr>
       <w:tblGrid>
@@ -1515,9 +986,6 @@
             <w:shd w:fill="D9EAF7"/>
           </w:tcPr>
           <w:p>
-            <w:pPr>
-              <w:jc w:val="left"/>
-            </w:pPr>
             <w:r>
               <w:rPr>
                 <w:b/>
@@ -1532,9 +1000,6 @@
             <w:shd w:fill="D9EAF7"/>
           </w:tcPr>
           <w:p>
-            <w:pPr>
-              <w:jc w:val="left"/>
-            </w:pPr>
             <w:r>
               <w:rPr>
                 <w:b/>
@@ -1550,13 +1015,7 @@
             <w:tcW w:type="dxa" w:w="4986"/>
           </w:tcPr>
           <w:p>
-            <w:pPr>
-              <w:jc w:val="left"/>
-            </w:pPr>
             <w:r>
-              <w:rPr>
-                <w:b w:val="0"/>
-              </w:rPr>
               <w:t>Không kết nối PostgreSQL/Oracle</w:t>
             </w:r>
           </w:p>
@@ -1566,14 +1025,8 @@
             <w:tcW w:type="dxa" w:w="4986"/>
           </w:tcPr>
           <w:p>
-            <w:pPr>
-              <w:jc w:val="left"/>
-            </w:pPr>
             <w:r>
-              <w:rPr>
-                <w:b w:val="0"/>
-              </w:rPr>
-              <w:t>Kiểm tra host, port, service, tài khoản, firewall và quyền database; chạy lại Kiểm tra đối chiếu.</w:t>
+              <w:t>Kiểm tra host, port, service, tài khoản, firewall và quyền cơ sở dữ liệu.</w:t>
             </w:r>
           </w:p>
         </w:tc>
@@ -1584,14 +1037,8 @@
             <w:tcW w:type="dxa" w:w="4986"/>
           </w:tcPr>
           <w:p>
-            <w:pPr>
-              <w:jc w:val="left"/>
-            </w:pPr>
             <w:r>
-              <w:rPr>
-                <w:b w:val="0"/>
-              </w:rPr>
-              <w:t>Không có dòng mới</w:t>
+              <w:t>Không có dữ liệu mới</w:t>
             </w:r>
           </w:p>
         </w:tc>
@@ -1600,14 +1047,8 @@
             <w:tcW w:type="dxa" w:w="4986"/>
           </w:tcPr>
           <w:p>
-            <w:pPr>
-              <w:jc w:val="left"/>
-            </w:pPr>
             <w:r>
-              <w:rPr>
-                <w:b w:val="0"/>
-              </w:rPr>
-              <w:t>Kiểm tra watermark, updated_at_utc của nguồn và vị trí có nằm trong FIR; thử check --full trước khi ghi lại.</w:t>
+              <w:t>Kiểm tra watermark, updated_at_utc, tọa độ nguồn và FIR; chạy check --full để chẩn đoán.</w:t>
             </w:r>
           </w:p>
         </w:tc>
@@ -1618,14 +1059,8 @@
             <w:tcW w:type="dxa" w:w="4986"/>
           </w:tcPr>
           <w:p>
-            <w:pPr>
-              <w:jc w:val="left"/>
-            </w:pPr>
             <w:r>
-              <w:rPr>
-                <w:b w:val="0"/>
-              </w:rPr>
-              <w:t>Nhiều dòng bị bỏ qua</w:t>
+              <w:t>Nhiều bản ghi bị bỏ qua</w:t>
             </w:r>
           </w:p>
         </w:tc>
@@ -1634,14 +1069,8 @@
             <w:tcW w:type="dxa" w:w="4986"/>
           </w:tcPr>
           <w:p>
-            <w:pPr>
-              <w:jc w:val="left"/>
-            </w:pPr>
             <w:r>
-              <w:rPr>
-                <w:b w:val="0"/>
-              </w:rPr>
-              <w:t>Rà soát chuyến bay trùng CALLSIGN + ngày và bảo đảm ETD/ETA hợp lệ để chọn được một khoảng duy nhất.</w:t>
+              <w:t>Rà soát chuyến bay trùng CALLSIGN + ngày và khoảng ETD-ETA.</w:t>
             </w:r>
           </w:p>
         </w:tc>
@@ -1652,14 +1081,8 @@
             <w:tcW w:type="dxa" w:w="4986"/>
           </w:tcPr>
           <w:p>
-            <w:pPr>
-              <w:jc w:val="left"/>
-            </w:pPr>
             <w:r>
-              <w:rPr>
-                <w:b w:val="0"/>
-              </w:rPr>
-              <w:t>API ready trả 503</w:t>
+              <w:t>Watermark sai</w:t>
             </w:r>
           </w:p>
         </w:tc>
@@ -1668,14 +1091,8 @@
             <w:tcW w:type="dxa" w:w="4986"/>
           </w:tcPr>
           <w:p>
-            <w:pPr>
-              <w:jc w:val="left"/>
-            </w:pPr>
             <w:r>
-              <w:rPr>
-                <w:b w:val="0"/>
-              </w:rPr>
-              <w:t>Kiểm tra cấu hình PostgreSQL và đường mạng từ máy API; live=200 chỉ xác nhận tiến trình còn chạy.</w:t>
+              <w:t>Dừng Auto, sao lưu watermark, chạy check --full trước khi đồng bộ lại.</w:t>
             </w:r>
           </w:p>
         </w:tc>
@@ -1686,14 +1103,8 @@
             <w:tcW w:type="dxa" w:w="4986"/>
           </w:tcPr>
           <w:p>
-            <w:pPr>
-              <w:jc w:val="left"/>
-            </w:pPr>
             <w:r>
-              <w:rPr>
-                <w:b w:val="0"/>
-              </w:rPr>
-              <w:t>Bản đồ không có dữ liệu</w:t>
+              <w:t>Có sai/thiếu/trùng</w:t>
             </w:r>
           </w:p>
         </w:tc>
@@ -1702,48 +1113,8 @@
             <w:tcW w:type="dxa" w:w="4986"/>
           </w:tcPr>
           <w:p>
-            <w:pPr>
-              <w:jc w:val="left"/>
-            </w:pPr>
             <w:r>
-              <w:rPr>
-                <w:b w:val="0"/>
-              </w:rPr>
-              <w:t>Kiểm tra health/live, health/ready, firewall cổng 5088 và cấu hình FlightTrackingApiBaseUrl của ATFM Web.</w:t>
-            </w:r>
-          </w:p>
-        </w:tc>
-      </w:tr>
-      <w:tr>
-        <w:tc>
-          <w:tcPr>
-            <w:tcW w:type="dxa" w:w="4986"/>
-          </w:tcPr>
-          <w:p>
-            <w:pPr>
-              <w:jc w:val="left"/>
-            </w:pPr>
-            <w:r>
-              <w:rPr>
-                <w:b w:val="0"/>
-              </w:rPr>
-              <w:t>Cần chạy lại toàn bộ</w:t>
-            </w:r>
-          </w:p>
-        </w:tc>
-        <w:tc>
-          <w:tcPr>
-            <w:tcW w:type="dxa" w:w="4986"/>
-          </w:tcPr>
-          <w:p>
-            <w:pPr>
-              <w:jc w:val="left"/>
-            </w:pPr>
-            <w:r>
-              <w:rPr>
-                <w:b w:val="0"/>
-              </w:rPr>
-              <w:t>Dừng Auto, sao lưu/đánh giá dữ liệu, chạy check --full trước; chỉ sync --full sau khi xác nhận kết quả.</w:t>
+              <w:t>Không bật Auto; đọc log, sửa nguyên nhân rồi chạy lại check -&gt; sync -&gt; verify.</w:t>
             </w:r>
           </w:p>
         </w:tc>
@@ -1754,7 +1125,7 @@
         <w:pStyle w:val="Heading1"/>
       </w:pPr>
       <w:r>
-        <w:t>8. Vận hành an toàn</w:t>
+        <w:t>7. Checklist vận hành</w:t>
       </w:r>
     </w:p>
     <w:p>
@@ -1762,7 +1133,7 @@
         <w:pStyle w:val="ListBullet"/>
       </w:pPr>
       <w:r>
-        <w:t>Luôn kiểm tra log sau mỗi thay đổi cấu hình; không bỏ qua traceback, lỗi sai/thiếu hoặc trùng khóa.</w:t>
+        <w:t>Đúng file cấu hình, kết nối PostgreSQL/Oracle và file FIR GeoJSON.</w:t>
       </w:r>
     </w:p>
     <w:p>
@@ -1770,7 +1141,7 @@
         <w:pStyle w:val="ListBullet"/>
       </w:pPr>
       <w:r>
-        <w:t>Không sửa hoặc xóa watermark trong khi Auto đang chạy. Sao lưu dữ liệu trước khi dùng --full trên môi trường thật.</w:t>
+        <w:t>Log không có traceback; sai, thiếu và khóa trùng bằng 0.</w:t>
       </w:r>
     </w:p>
     <w:p>
@@ -1778,7 +1149,7 @@
         <w:pStyle w:val="ListBullet"/>
       </w:pPr>
       <w:r>
-        <w:t>Giữ quyền tối thiểu: Flight Tracking API chỉ cần đọc PostgreSQL; TracksSync chỉ dùng quyền Oracle cần thiết cho nhiệm vụ đồng bộ.</w:t>
+        <w:t>Watermark chỉ tăng sau sync/all thành công.</w:t>
       </w:r>
     </w:p>
     <w:p>
@@ -1786,7 +1157,7 @@
         <w:pStyle w:val="ListBullet"/>
       </w:pPr>
       <w:r>
-        <w:t>Theo dõi tuổi watermark, kết quả verify, dung lượng T_TRACKS_LOG, trạng thái health/ready và tần suất lỗi Auto.</w:t>
+        <w:t>Không chạy song song nhiều Auto hoặc Task Scheduler trên cùng watermark.</w:t>
       </w:r>
     </w:p>
     <w:p>
@@ -1794,7 +1165,7 @@
         <w:pStyle w:val="ListBullet"/>
       </w:pPr>
       <w:r>
-        <w:t>Dừng các tiến trình liên quan trước khi nâng cấp; giữ lại file cấu hình local và log cần thiết để có thể khôi phục vận hành.</w:t>
+        <w:t>Sao lưu/đánh giá dữ liệu trước khi dùng --full trên môi trường thật.</w:t>
       </w:r>
     </w:p>
     <w:sectPr>

</xml_diff>

<commit_message>
docs: use TracksSync GUI screenshot in guide
</commit_message>
<xml_diff>
--- a/TaiLieu/Huong_dan_su_dung_Tool_ADS-B_20260919.docx
+++ b/TaiLieu/Huong_dan_su_dung_Tool_ADS-B_20260919.docx
@@ -906,12 +906,12 @@
         <w:pStyle w:val="Heading1"/>
       </w:pPr>
       <w:r>
-        <w:t>5. Kết quả khai thác</w:t>
+        <w:t>5. Giao diện công cụ</w:t>
       </w:r>
     </w:p>
     <w:p>
       <w:r>
-        <w:t>T_TRACKS_LOG là đầu ra nghiệp vụ của TracksSyncPython, phục vụ báo cáo hiệu suất ADS-B trong ATFM Web.</w:t>
+        <w:t>Giao diện TracksSyncPython hiển thị các nút Kiểm tra đối chiếu, Ghi T_TRACKS_LOG, Xác minh kết quả, Auto, Stop, trường Chu kỳ và vùng log vận hành.</w:t>
       </w:r>
     </w:p>
     <w:p>
@@ -921,7 +921,7 @@
       <w:r>
         <w:drawing>
           <wp:inline xmlns:a="http://schemas.openxmlformats.org/drawingml/2006/main" xmlns:pic="http://schemas.openxmlformats.org/drawingml/2006/picture">
-            <wp:extent cx="5688000" cy="7316117"/>
+            <wp:extent cx="5688000" cy="3800345"/>
             <wp:docPr id="1" name="Picture 1"/>
             <wp:cNvGraphicFramePr>
               <a:graphicFrameLocks noChangeAspect="1"/>
@@ -930,7 +930,7 @@
               <a:graphicData uri="http://schemas.openxmlformats.org/drawingml/2006/picture">
                 <pic:pic>
                   <pic:nvPicPr>
-                    <pic:cNvPr id="0" name="adsb-report.png"/>
+                    <pic:cNvPr id="0" name="TracksSyncPython_GUI_20260919.png"/>
                     <pic:cNvPicPr/>
                   </pic:nvPicPr>
                   <pic:blipFill>
@@ -942,7 +942,7 @@
                   <pic:spPr>
                     <a:xfrm>
                       <a:off x="0" y="0"/>
-                      <a:ext cx="5688000" cy="7316117"/>
+                      <a:ext cx="5688000" cy="3800345"/>
                     </a:xfrm>
                     <a:prstGeom prst="rect"/>
                   </pic:spPr>
@@ -958,7 +958,7 @@
         <w:jc w:val="center"/>
       </w:pPr>
       <w:r>
-        <w:t>Hình 1. Báo cáo hiệu suất ADS-B sử dụng dữ liệu T_TRACKS_LOG.</w:t>
+        <w:t>Hình 1. Giao diện thực tế của công cụ ATFM FIR Tracks Logger (TracksSyncPython).</w:t>
       </w:r>
     </w:p>
     <w:p>

</xml_diff>